<commit_message>
Add article: What Is Vedic Jyotisa, and How Is It Different from Western Astrology (published)
</commit_message>
<xml_diff>
--- a/martanda-site/vedic-vs-western-jyotish.docx.docx
+++ b/martanda-site/vedic-vs-western-jyotish.docx.docx
@@ -396,7 +396,7 @@
         </w:rPr>
         <w:lastRenderedPageBreak/>
         <w:drawing>
-          <wp:inline distT="0" distB="0" distL="0" distR="0" wp14:anchorId="0D47FE84" wp14:editId="1DFBCFE4">
+          <wp:inline distT="0" distB="0" distL="0" distR="0" wp14:anchorId="1940B95E" wp14:editId="631419D2">
             <wp:extent cx="3420000" cy="3420000"/>
             <wp:effectExtent l="0" t="0" r="0" b="0"/>
             <wp:docPr id="1" name="Picture 1"/>
@@ -480,7 +480,7 @@
           <w:noProof/>
         </w:rPr>
         <w:drawing>
-          <wp:inline distT="0" distB="0" distL="0" distR="0" wp14:anchorId="606331AC" wp14:editId="58757723">
+          <wp:inline distT="0" distB="0" distL="0" distR="0" wp14:anchorId="152F82DB" wp14:editId="5ABBBECF">
             <wp:extent cx="3420000" cy="3420000"/>
             <wp:effectExtent l="0" t="0" r="0" b="0"/>
             <wp:docPr id="2" name="Picture 2"/>
@@ -600,7 +600,7 @@
           <w:rFonts w:eastAsia="Gentium Book Basic" w:cs="Gentium Book Basic"/>
           <w:sz w:val="23"/>
         </w:rPr>
-        <w:t>The South Indian style shown above — also called the Śukra Cakra — uses a fixed square grid. The twelve signs always sit in the same twelve boxes, in the same order, no matter whose chart you're looking at. Only the label marking the Ascendant (Lagna) moves from chart to chart. This is different from the North Indian style, also called the Guru Cakra, which is diamond-shaped — there, the Ascendant is always fixed at the top, and it's the signs that rotate around it instead. Both differ from the Western circular wheel, where house cusps are drawn at the exact degree the Ascendant and subsequent houses fall, rather than snapping to whole sign boundaries.</w:t>
+        <w:t>The South Indian style shown above — also called the Guru Cakra — uses a fixed square grid. The twelve signs always sit in the same twelve boxes, in the same order, no matter whose chart you're looking at. Only the label marking the Ascendant (Lagna) moves from chart to chart. This is different from the North Indian style, also called the Śukra Cakra, which is diamond-shaped — there, the Ascendant is always fixed at the top, and it's the signs that rotate around it instead. Both differ from the Western circular wheel, where house cusps are drawn at the exact degree the Ascendant and subsequent houses fall, rather than snapping to whole sign boundaries.</w:t>
       </w:r>
     </w:p>
     <w:p>
@@ -649,7 +649,7 @@
                 <w:noProof/>
               </w:rPr>
               <w:drawing>
-                <wp:inline distT="0" distB="0" distL="0" distR="0" wp14:anchorId="2D6869E2" wp14:editId="19B2D9B9">
+                <wp:inline distT="0" distB="0" distL="0" distR="0" wp14:anchorId="6F93EE54" wp14:editId="192AF245">
                   <wp:extent cx="2448000" cy="2448000"/>
                   <wp:effectExtent l="0" t="0" r="0" b="0"/>
                   <wp:docPr id="3" name="Picture 3"/>
@@ -702,7 +702,7 @@
                 <w:noProof/>
               </w:rPr>
               <w:drawing>
-                <wp:inline distT="0" distB="0" distL="0" distR="0" wp14:anchorId="7D5740C8" wp14:editId="175D29CD">
+                <wp:inline distT="0" distB="0" distL="0" distR="0" wp14:anchorId="1F9D0E52" wp14:editId="673B1DAE">
                   <wp:extent cx="2448000" cy="2448000"/>
                   <wp:effectExtent l="0" t="0" r="0" b="0"/>
                   <wp:docPr id="4" name="Picture 4"/>
@@ -762,7 +762,7 @@
                 <w:b/>
                 <w:color w:val="6E1F2A"/>
               </w:rPr>
-              <w:t>South Indian (Śukra Cakra)</w:t>
+              <w:t>South Indian (Guru Cakra)</w:t>
             </w:r>
           </w:p>
         </w:tc>
@@ -784,7 +784,7 @@
                 <w:b/>
                 <w:color w:val="6E1F2A"/>
               </w:rPr>
-              <w:t>North Indian (Guru Cakra)</w:t>
+              <w:t>North Indian (Śukra Cakra)</w:t>
             </w:r>
           </w:p>
         </w:tc>
@@ -806,7 +806,7 @@
           <w:sz w:val="20"/>
         </w:rPr>
         <w:lastRenderedPageBreak/>
-        <w:t>The same underlying placement — Sun in Aries — drawn two different ways. The South Indian (Śukra Cakra) chart keeps the signs fixed and moves the house numbers; the North Indian (Guru Cakra) chart keeps the houses fixed — Lagna always at the top — and moves the sign numbers instead.</w:t>
+        <w:t>The same underlying placement — Sun in Aries — drawn two different ways. The South Indian (Guru Cakra) chart keeps the signs fixed and moves the house numbers; the North Indian (Śukra Cakra) chart keeps the houses fixed — Lagna always at the top — and moves the sign numbers instead.</w:t>
       </w:r>
     </w:p>
     <w:p>
@@ -879,8 +879,7 @@
       <w:pPr>
         <w:jc w:val="both"/>
         <w:rPr>
-          <w:rFonts w:eastAsia="Gentium Book Basic" w:cs="Gentium Book Basic"/>
-          <w:sz w:val="23"/>
+          <w:rFonts w:hint="eastAsia"/>
         </w:rPr>
       </w:pPr>
       <w:r>
@@ -893,18 +892,15 @@
     </w:p>
     <w:p>
       <w:pPr>
-        <w:jc w:val="both"/>
+        <w:pBdr>
+          <w:bottom w:val="single" w:sz="8" w:space="4" w:color="9A7B2E"/>
+        </w:pBdr>
+        <w:spacing w:before="360" w:after="160"/>
         <w:rPr>
           <w:rFonts w:eastAsia="Gentium Book Basic" w:cs="Gentium Book Basic"/>
-          <w:sz w:val="23"/>
-        </w:rPr>
-      </w:pPr>
-    </w:p>
-    <w:p>
-      <w:pPr>
-        <w:jc w:val="both"/>
-        <w:rPr>
-          <w:rFonts w:hint="eastAsia"/>
+          <w:b/>
+          <w:color w:val="1B2A4A"/>
+          <w:sz w:val="36"/>
         </w:rPr>
       </w:pPr>
     </w:p>
@@ -951,11 +947,11 @@
         <w:tblLook w:val="04A0" w:firstRow="1" w:lastRow="0" w:firstColumn="1" w:lastColumn="0" w:noHBand="0" w:noVBand="1"/>
       </w:tblPr>
       <w:tblGrid>
-        <w:gridCol w:w="1814"/>
-        <w:gridCol w:w="1474"/>
+        <w:gridCol w:w="1795"/>
+        <w:gridCol w:w="1459"/>
         <w:gridCol w:w="907"/>
-        <w:gridCol w:w="964"/>
-        <w:gridCol w:w="3572"/>
+        <w:gridCol w:w="963"/>
+        <w:gridCol w:w="3516"/>
       </w:tblGrid>
       <w:tr>
         <w:trPr>
@@ -2098,6 +2094,20 @@
         </w:pBdr>
         <w:spacing w:before="360" w:after="160"/>
         <w:rPr>
+          <w:rFonts w:eastAsia="Gentium Book Basic" w:cs="Gentium Book Basic"/>
+          <w:b/>
+          <w:color w:val="1B2A4A"/>
+          <w:sz w:val="36"/>
+        </w:rPr>
+      </w:pPr>
+    </w:p>
+    <w:p>
+      <w:pPr>
+        <w:pBdr>
+          <w:bottom w:val="single" w:sz="8" w:space="4" w:color="9A7B2E"/>
+        </w:pBdr>
+        <w:spacing w:before="360" w:after="160"/>
+        <w:rPr>
           <w:rFonts w:hint="eastAsia"/>
         </w:rPr>
       </w:pPr>
@@ -2108,6 +2118,7 @@
           <w:color w:val="1B2A4A"/>
           <w:sz w:val="36"/>
         </w:rPr>
+        <w:lastRenderedPageBreak/>
         <w:t>Why This Matters</w:t>
       </w:r>
     </w:p>
@@ -2123,7 +2134,6 @@
           <w:rFonts w:eastAsia="Gentium Book Basic" w:cs="Gentium Book Basic"/>
           <w:sz w:val="23"/>
         </w:rPr>
-        <w:lastRenderedPageBreak/>
         <w:t>None of this makes one system "more correct" than the other in an absolute sense — they're answering different questions, using different reference frames, built up over different (though related) intellectual traditions. But if you've ever wondered why your Vedic rāśi doesn't match your Western sun sign, now you know precisely why, down to the degree: a slow 25,800-year wobble in the Earth's axis, accumulated over two thousand years into a roughly 24° gap between two equally valid ways of asking "where is the Sun, really?"</w:t>
       </w:r>
     </w:p>
@@ -2259,7 +2269,7 @@
         <w:color w:val="6E1F2A"/>
         <w:sz w:val="18"/>
       </w:rPr>
-      <w:t>J</w:t>
+      <w:t>Jyoti</w:t>
     </w:r>
     <w:r>
       <w:rPr>
@@ -2268,7 +2278,7 @@
         <w:color w:val="6E1F2A"/>
         <w:sz w:val="18"/>
       </w:rPr>
-      <w:t>yoti</w:t>
+      <w:t>ṣī</w:t>
     </w:r>
     <w:r>
       <w:rPr>
@@ -2277,8 +2287,9 @@
         <w:color w:val="6E1F2A"/>
         <w:sz w:val="18"/>
       </w:rPr>
-      <w:t>ṣī</w:t>
+      <w:t xml:space="preserve"> </w:t>
     </w:r>
+    <w:proofErr w:type="gramStart"/>
     <w:r>
       <w:rPr>
         <w:rFonts w:eastAsia="Gentium Book Basic" w:cs="Gentium Book Basic"/>
@@ -2286,8 +2297,18 @@
         <w:color w:val="6E1F2A"/>
         <w:sz w:val="18"/>
       </w:rPr>
-      <w:t xml:space="preserve"> · Classical</w:t>
+      <w:t>·</w:t>
     </w:r>
+    <w:r>
+      <w:rPr>
+        <w:rFonts w:eastAsia="Gentium Book Basic" w:cs="Gentium Book Basic"/>
+        <w:i/>
+        <w:color w:val="6E1F2A"/>
+        <w:sz w:val="18"/>
+      </w:rPr>
+      <w:t xml:space="preserve">  Classical</w:t>
+    </w:r>
+    <w:proofErr w:type="gramEnd"/>
     <w:r>
       <w:rPr>
         <w:rFonts w:eastAsia="Gentium Book Basic" w:cs="Gentium Book Basic"/>
@@ -2530,31 +2551,31 @@
       </w:rPr>
     </w:lvl>
   </w:abstractNum>
-  <w:num w:numId="1" w16cid:durableId="31882117">
+  <w:num w:numId="1" w16cid:durableId="165288857">
     <w:abstractNumId w:val="8"/>
   </w:num>
-  <w:num w:numId="2" w16cid:durableId="1869416513">
+  <w:num w:numId="2" w16cid:durableId="910040437">
     <w:abstractNumId w:val="6"/>
   </w:num>
-  <w:num w:numId="3" w16cid:durableId="1747729598">
+  <w:num w:numId="3" w16cid:durableId="1585846257">
     <w:abstractNumId w:val="5"/>
   </w:num>
-  <w:num w:numId="4" w16cid:durableId="1542665905">
+  <w:num w:numId="4" w16cid:durableId="344983364">
     <w:abstractNumId w:val="4"/>
   </w:num>
-  <w:num w:numId="5" w16cid:durableId="1120800928">
+  <w:num w:numId="5" w16cid:durableId="1711760723">
     <w:abstractNumId w:val="7"/>
   </w:num>
-  <w:num w:numId="6" w16cid:durableId="781001114">
+  <w:num w:numId="6" w16cid:durableId="1122384833">
     <w:abstractNumId w:val="3"/>
   </w:num>
-  <w:num w:numId="7" w16cid:durableId="921766131">
+  <w:num w:numId="7" w16cid:durableId="1661233324">
     <w:abstractNumId w:val="2"/>
   </w:num>
-  <w:num w:numId="8" w16cid:durableId="1846944353">
+  <w:num w:numId="8" w16cid:durableId="1407265924">
     <w:abstractNumId w:val="1"/>
   </w:num>
-  <w:num w:numId="9" w16cid:durableId="772672234">
+  <w:num w:numId="9" w16cid:durableId="352078647">
     <w:abstractNumId w:val="0"/>
   </w:num>
 </w:numbering>

</xml_diff>